<commit_message>
docs: cut commentary about the documents from the documents
the contribution table explained why it was laid out the way it was, which is
a note to a reader about the document rather than a record of who did what.
same for a couple of lines in the sprint report and the deployment runbook.

peter and roland get sign initials like everyone else, and daniel's row now
names the agent-facing security work in his commits (api keys for agent auth,
audit verify endpoint, rate limiting).

readme also provided as plain text.
</commit_message>
<xml_diff>
--- a/docs/docx/contribution-table.docx
+++ b/docs/docx/contribution-table.docx
@@ -632,7 +632,7 @@
               <w:rPr>
                 <w:sz w:val="16"/>
               </w:rPr>
-              <w:t>Backend logic, database models, system behaviour</w:t>
+              <w:t>Backend logic, database models, system behaviour, agent-facing security</w:t>
             </w:r>
           </w:p>
         </w:tc>
@@ -654,7 +654,7 @@
               <w:rPr>
                 <w:sz w:val="16"/>
               </w:rPr>
-              <w:t>Postgres/SQLAlchemy models, risk classifier, rate limiting, agent registry CRUD, audit verification</w:t>
+              <w:t>Postgres/SQLAlchemy models, risk classifier, rate limiting, agent registry CRUD, API keys for agent authentication, audit chain verification endpoint</w:t>
             </w:r>
           </w:p>
         </w:tc>
@@ -912,14 +912,15 @@
         <w:tblLook w:firstColumn="1" w:firstRow="1" w:lastColumn="0" w:lastRow="0" w:noHBand="0" w:noVBand="1" w:val="04A0"/>
       </w:tblPr>
       <w:tblGrid>
-        <w:gridCol w:w="3552"/>
-        <w:gridCol w:w="3552"/>
-        <w:gridCol w:w="3552"/>
+        <w:gridCol w:w="2664"/>
+        <w:gridCol w:w="2664"/>
+        <w:gridCol w:w="2664"/>
+        <w:gridCol w:w="2664"/>
       </w:tblGrid>
       <w:tr>
         <w:tc>
           <w:tcPr>
-            <w:tcW w:type="dxa" w:w="3552"/>
+            <w:tcW w:type="dxa" w:w="2664"/>
             <w:shd w:val="clear" w:fill="1B3A6B"/>
           </w:tcPr>
           <w:p>
@@ -936,7 +937,7 @@
         </w:tc>
         <w:tc>
           <w:tcPr>
-            <w:tcW w:type="dxa" w:w="3552"/>
+            <w:tcW w:type="dxa" w:w="2664"/>
             <w:shd w:val="clear" w:fill="1B3A6B"/>
           </w:tcPr>
           <w:p>
@@ -953,7 +954,7 @@
         </w:tc>
         <w:tc>
           <w:tcPr>
-            <w:tcW w:type="dxa" w:w="3552"/>
+            <w:tcW w:type="dxa" w:w="2664"/>
             <w:shd w:val="clear" w:fill="1B3A6B"/>
           </w:tcPr>
           <w:p>
@@ -968,11 +969,28 @@
             </w:r>
           </w:p>
         </w:tc>
+        <w:tc>
+          <w:tcPr>
+            <w:tcW w:type="dxa" w:w="2664"/>
+            <w:shd w:val="clear" w:fill="1B3A6B"/>
+          </w:tcPr>
+          <w:p>
+            <w:r/>
+            <w:r>
+              <w:rPr>
+                <w:b/>
+                <w:color w:val="FFFFFF"/>
+                <w:sz w:val="15"/>
+              </w:rPr>
+              <w:t>SIGN</w:t>
+            </w:r>
+          </w:p>
+        </w:tc>
       </w:tr>
       <w:tr>
         <w:tc>
           <w:tcPr>
-            <w:tcW w:type="dxa" w:w="3552"/>
+            <w:tcW w:type="dxa" w:w="2664"/>
           </w:tcPr>
           <w:p>
             <w:pPr>
@@ -993,7 +1011,7 @@
         </w:tc>
         <w:tc>
           <w:tcPr>
-            <w:tcW w:type="dxa" w:w="3552"/>
+            <w:tcW w:type="dxa" w:w="2664"/>
           </w:tcPr>
           <w:p>
             <w:pPr>
@@ -1014,7 +1032,7 @@
         </w:tc>
         <w:tc>
           <w:tcPr>
-            <w:tcW w:type="dxa" w:w="3552"/>
+            <w:tcW w:type="dxa" w:w="2664"/>
           </w:tcPr>
           <w:p>
             <w:pPr>
@@ -1033,11 +1051,32 @@
             </w:r>
           </w:p>
         </w:tc>
+        <w:tc>
+          <w:tcPr>
+            <w:tcW w:type="dxa" w:w="2664"/>
+          </w:tcPr>
+          <w:p>
+            <w:pPr>
+              <w:spacing w:after="20"/>
+            </w:pPr>
+            <w:r>
+              <w:rPr>
+                <w:sz w:val="16"/>
+              </w:rPr>
+            </w:r>
+            <w:r>
+              <w:rPr>
+                <w:sz w:val="16"/>
+              </w:rPr>
+              <w:t>P.A.</w:t>
+            </w:r>
+          </w:p>
+        </w:tc>
       </w:tr>
       <w:tr>
         <w:tc>
           <w:tcPr>
-            <w:tcW w:type="dxa" w:w="3552"/>
+            <w:tcW w:type="dxa" w:w="2664"/>
             <w:shd w:val="clear" w:fill="F7F9FC"/>
           </w:tcPr>
           <w:p>
@@ -1059,7 +1098,7 @@
         </w:tc>
         <w:tc>
           <w:tcPr>
-            <w:tcW w:type="dxa" w:w="3552"/>
+            <w:tcW w:type="dxa" w:w="2664"/>
             <w:shd w:val="clear" w:fill="F7F9FC"/>
           </w:tcPr>
           <w:p>
@@ -1081,7 +1120,7 @@
         </w:tc>
         <w:tc>
           <w:tcPr>
-            <w:tcW w:type="dxa" w:w="3552"/>
+            <w:tcW w:type="dxa" w:w="2664"/>
             <w:shd w:val="clear" w:fill="F7F9FC"/>
           </w:tcPr>
           <w:p>
@@ -1101,6 +1140,28 @@
             </w:r>
           </w:p>
         </w:tc>
+        <w:tc>
+          <w:tcPr>
+            <w:tcW w:type="dxa" w:w="2664"/>
+            <w:shd w:val="clear" w:fill="F7F9FC"/>
+          </w:tcPr>
+          <w:p>
+            <w:pPr>
+              <w:spacing w:after="20"/>
+            </w:pPr>
+            <w:r>
+              <w:rPr>
+                <w:sz w:val="16"/>
+              </w:rPr>
+            </w:r>
+            <w:r>
+              <w:rPr>
+                <w:sz w:val="16"/>
+              </w:rPr>
+              <w:t>R.A.</w:t>
+            </w:r>
+          </w:p>
+        </w:tc>
       </w:tr>
     </w:tbl>
     <w:p/>
@@ -1109,39 +1170,7 @@
         <w:spacing w:after="120"/>
       </w:pPr>
       <w:r>
-        <w:t>Splitting the table this way rather than merging the two groups is deliberate.</w:t>
-      </w:r>
-    </w:p>
-    <w:p>
-      <w:pPr>
-        <w:spacing w:after="120"/>
-      </w:pPr>
-      <w:r>
-        <w:t>It shows who wrote which part of the system honestly, without dropping members</w:t>
-      </w:r>
-    </w:p>
-    <w:p>
-      <w:pPr>
-        <w:spacing w:after="120"/>
-      </w:pPr>
-      <w:r>
-        <w:t>who contributed earlier in the project.</w:t>
-      </w:r>
-    </w:p>
-    <w:p>
-      <w:pPr>
-        <w:spacing w:after="120"/>
-      </w:pPr>
-      <w:r>
-        <w:t>Presentation delivery: Nico presents. The A4 marking sheet scores presentation</w:t>
-      </w:r>
-    </w:p>
-    <w:p>
-      <w:pPr>
-        <w:spacing w:after="120"/>
-      </w:pPr>
-      <w:r>
-        <w:t>structure and content, not how the speaking is divided up.</w:t>
+        <w:t>Presentation delivered by Nico.</w:t>
       </w:r>
     </w:p>
     <w:p>

</xml_diff>